<commit_message>
Refines UI, updates documentation, and adds favicon
Introduces a new SVG favicon for enhanced visual identity.
Adds comprehensive styling for a new 'owner' (`.proprietario`) section, including responsive adjustments.

Significantly updates the project documentation:
- Improves content clarity and conciseness across all sections.
- Corrects Portuguese spelling errors (e.g., 'Arquitetura', 'corretamente').
- Adjusts page and figure numbering.
- Updates binary diagram and PDF documentation files.

Corrects phone numbers in contact information.
Adjusts main navigation by swapping 'Áreas' and 'Galeria' links across all HTML pages to better reflect content flow.
Removes redundant 'Voltar ao topo' links from footers and tidies up HTML file endings.
Adds a `.gitignore` file for better version control management.
</commit_message>
<xml_diff>
--- a/doc/Capa - Documentação - InfoTech by Júlio Mulhanga.docx
+++ b/doc/Capa - Documentação - InfoTech by Júlio Mulhanga.docx
@@ -1,6 +1,6 @@
 
 <file path=word/document.xml><?xml version="1.0" encoding="utf-8"?>
-<w:document xmlns:wpc="http://schemas.microsoft.com/office/word/2010/wordprocessingCanvas" xmlns:cx="http://schemas.microsoft.com/office/drawing/2014/chartex" xmlns:cx1="http://schemas.microsoft.com/office/drawing/2015/9/8/chartex" xmlns:cx2="http://schemas.microsoft.com/office/drawing/2015/10/21/chartex" xmlns:cx3="http://schemas.microsoft.com/office/drawing/2016/5/9/chartex" xmlns:cx4="http://schemas.microsoft.com/office/drawing/2016/5/10/chartex" xmlns:cx5="http://schemas.microsoft.com/office/drawing/2016/5/11/chartex" xmlns:cx6="http://schemas.microsoft.com/office/drawing/2016/5/12/chartex" xmlns:cx7="http://schemas.microsoft.com/office/drawing/2016/5/13/chartex" xmlns:cx8="http://schemas.microsoft.com/office/drawing/2016/5/14/chartex" xmlns:mc="http://schemas.openxmlformats.org/markup-compatibility/2006" xmlns:aink="http://schemas.microsoft.com/office/drawing/2016/ink" xmlns:am3d="http://schemas.microsoft.com/office/drawing/2017/model3d" xmlns:o="urn:schemas-microsoft-com:office:office" xmlns:oel="http://schemas.microsoft.com/office/2019/extlst" xmlns:r="http://schemas.openxmlformats.org/officeDocument/2006/relationships" xmlns:m="http://schemas.openxmlformats.org/officeDocument/2006/math" xmlns:v="urn:schemas-microsoft-com:vml" xmlns:wp14="http://schemas.microsoft.com/office/word/2010/wordprocessingDrawing" xmlns:wp="http://schemas.openxmlformats.org/drawingml/2006/wordprocessingDrawing" xmlns:w10="urn:schemas-microsoft-com:office:word" xmlns:w="http://schemas.openxmlformats.org/wordprocessingml/2006/main" xmlns:w14="http://schemas.microsoft.com/office/word/2010/wordml" xmlns:w15="http://schemas.microsoft.com/office/word/2012/wordml" xmlns:w16cei="http://schemas.microsoft.com/office/word/2026/wordml/cei" xmlns:w16cex="http://schemas.microsoft.com/office/word/2018/wordml/cex" xmlns:w16cid="http://schemas.microsoft.com/office/word/2016/wordml/cid" xmlns:w16="http://schemas.microsoft.com/office/word/2018/wordml" xmlns:w16du="http://schemas.microsoft.com/office/word/2023/wordml/word16du" xmlns:w16sdtdh="http://schemas.microsoft.com/office/word/2020/wordml/sdtdatahash" xmlns:w16sdtfl="http://schemas.microsoft.com/office/word/2024/wordml/sdtformatlock" xmlns:w16se="http://schemas.microsoft.com/office/word/2015/wordml/symex" xmlns:wpg="http://schemas.microsoft.com/office/word/2010/wordprocessingGroup" xmlns:wpi="http://schemas.microsoft.com/office/word/2010/wordprocessingInk" xmlns:wne="http://schemas.microsoft.com/office/word/2006/wordml" xmlns:wps="http://schemas.microsoft.com/office/word/2010/wordprocessingShape" mc:Ignorable="w14 w15 w16se w16cid w16 w16cex w16sdtdh w16sdtfl w16du wp14">
+<w:document xmlns:wpc="http://schemas.microsoft.com/office/word/2010/wordprocessingCanvas" xmlns:cx="http://schemas.microsoft.com/office/drawing/2014/chartex" xmlns:cx1="http://schemas.microsoft.com/office/drawing/2015/9/8/chartex" xmlns:cx2="http://schemas.microsoft.com/office/drawing/2015/10/21/chartex" xmlns:cx3="http://schemas.microsoft.com/office/drawing/2016/5/9/chartex" xmlns:cx4="http://schemas.microsoft.com/office/drawing/2016/5/10/chartex" xmlns:cx5="http://schemas.microsoft.com/office/drawing/2016/5/11/chartex" xmlns:cx6="http://schemas.microsoft.com/office/drawing/2016/5/12/chartex" xmlns:cx7="http://schemas.microsoft.com/office/drawing/2016/5/13/chartex" xmlns:cx8="http://schemas.microsoft.com/office/drawing/2016/5/14/chartex" xmlns:mc="http://schemas.openxmlformats.org/markup-compatibility/2006" xmlns:aink="http://schemas.microsoft.com/office/drawing/2016/ink" xmlns:am3d="http://schemas.microsoft.com/office/drawing/2017/model3d" xmlns:o="urn:schemas-microsoft-com:office:office" xmlns:oel="http://schemas.microsoft.com/office/2019/extlst" xmlns:r="http://schemas.openxmlformats.org/officeDocument/2006/relationships" xmlns:m="http://schemas.openxmlformats.org/officeDocument/2006/math" xmlns:v="urn:schemas-microsoft-com:vml" xmlns:wp14="http://schemas.microsoft.com/office/word/2010/wordprocessingDrawing" xmlns:wp="http://schemas.openxmlformats.org/drawingml/2006/wordprocessingDrawing" xmlns:w10="urn:schemas-microsoft-com:office:word" xmlns:w="http://schemas.openxmlformats.org/wordprocessingml/2006/main" xmlns:w14="http://schemas.microsoft.com/office/word/2010/wordml" xmlns:w15="http://schemas.microsoft.com/office/word/2012/wordml" xmlns:w16cex="http://schemas.microsoft.com/office/word/2018/wordml/cex" xmlns:w16cid="http://schemas.microsoft.com/office/word/2016/wordml/cid" xmlns:w16="http://schemas.microsoft.com/office/word/2018/wordml" xmlns:w16du="http://schemas.microsoft.com/office/word/2023/wordml/word16du" xmlns:w16sdtdh="http://schemas.microsoft.com/office/word/2020/wordml/sdtdatahash" xmlns:w16sdtfl="http://schemas.microsoft.com/office/word/2024/wordml/sdtformatlock" xmlns:w16se="http://schemas.microsoft.com/office/word/2015/wordml/symex" xmlns:wpg="http://schemas.microsoft.com/office/word/2010/wordprocessingGroup" xmlns:wpi="http://schemas.microsoft.com/office/word/2010/wordprocessingInk" xmlns:wne="http://schemas.microsoft.com/office/word/2006/wordml" xmlns:wps="http://schemas.microsoft.com/office/word/2010/wordprocessingShape" mc:Ignorable="w14 w15 w16se w16cid w16 w16cex w16sdtdh w16sdtfl w16du wp14">
   <w:body>
     <w:tbl>
       <w:tblPr>
@@ -22,9 +22,6 @@
           <w:p>
             <w:pPr>
               <w:jc w:val="center"/>
-              <w:rPr>
-                <w:lang w:val="pt-PT"/>
-              </w:rPr>
             </w:pPr>
           </w:p>
           <w:p>
@@ -60,36 +57,6 @@
                 <w:lang w:val="pt-PT"/>
               </w:rPr>
               <w:t>Júlio Armando Mulhanga</w:t>
-            </w:r>
-          </w:p>
-          <w:p>
-            <w:pPr>
-              <w:jc w:val="center"/>
-              <w:rPr>
-                <w:lang w:val="pt-PT"/>
-              </w:rPr>
-            </w:pPr>
-            <w:r>
-              <w:rPr>
-                <w:rFonts w:cs="Times New Roman"/>
-                <w:b/>
-                <w:bCs/>
-                <w:lang w:val="pt-PT"/>
-              </w:rPr>
-              <w:t>Código</w:t>
-            </w:r>
-            <w:r>
-              <w:rPr>
-                <w:rFonts w:cs="Times New Roman"/>
-                <w:lang w:val="pt-PT"/>
-              </w:rPr>
-              <w:t xml:space="preserve">: </w:t>
-            </w:r>
-            <w:r>
-              <w:rPr>
-                <w:lang w:val="pt-PT"/>
-              </w:rPr>
-              <w:t>20240318</w:t>
             </w:r>
           </w:p>
           <w:p>
@@ -505,36 +472,6 @@
                 <w:lang w:val="pt-PT"/>
               </w:rPr>
               <w:t>Júlio Armando Mulhanga</w:t>
-            </w:r>
-          </w:p>
-          <w:p>
-            <w:pPr>
-              <w:jc w:val="center"/>
-              <w:rPr>
-                <w:lang w:val="pt-PT"/>
-              </w:rPr>
-            </w:pPr>
-            <w:r>
-              <w:rPr>
-                <w:rFonts w:cs="Times New Roman"/>
-                <w:b/>
-                <w:bCs/>
-                <w:lang w:val="pt-PT"/>
-              </w:rPr>
-              <w:t>Código</w:t>
-            </w:r>
-            <w:r>
-              <w:rPr>
-                <w:rFonts w:cs="Times New Roman"/>
-                <w:lang w:val="pt-PT"/>
-              </w:rPr>
-              <w:t xml:space="preserve">: </w:t>
-            </w:r>
-            <w:r>
-              <w:rPr>
-                <w:lang w:val="pt-PT"/>
-              </w:rPr>
-              <w:t>20240318</w:t>
             </w:r>
           </w:p>
           <w:p>
@@ -853,7 +790,7 @@
                     </wp:anchor>
                   </w:drawing>
                 </mc:Choice>
-                <mc:Fallback>
+                <mc:Fallback xmlns:w16cei="http://schemas.microsoft.com/office/word/2026/wordml/cei">
                   <w:pict>
                     <v:shapetype w14:anchorId="563A45EA" id="_x0000_t202" coordsize="21600,21600" o:spt="202" path="m,l,21600r21600,l21600,xe">
                       <v:stroke joinstyle="miter"/>

</xml_diff>